<commit_message>
Added KPI structure, SO check out fxn
</commit_message>
<xml_diff>
--- a/backend_django/batch_ticket_template/Batch_ticket_template.docx
+++ b/backend_django/batch_ticket_template/Batch_ticket_template.docx
@@ -560,12 +560,11 @@
       </w:tr>
       <w:tr>
         <w:trPr>
-          <w:trHeight w:val="368"/>
+          <w:trHeight w:val="745"/>
         </w:trPr>
         <w:tc>
           <w:tcPr>
             <w:tcW w:w="1540" w:type="dxa"/>
-            <w:vMerge w:val="restart"/>
           </w:tcPr>
           <w:p>
             <w:pPr>
@@ -580,7 +579,6 @@
         <w:tc>
           <w:tcPr>
             <w:tcW w:w="1540" w:type="dxa"/>
-            <w:vMerge w:val="restart"/>
           </w:tcPr>
           <w:p>
             <w:pPr>
@@ -595,7 +593,6 @@
         <w:tc>
           <w:tcPr>
             <w:tcW w:w="1539" w:type="dxa"/>
-            <w:vMerge w:val="restart"/>
           </w:tcPr>
           <w:p>
             <w:pPr>
@@ -625,7 +622,6 @@
         <w:tc>
           <w:tcPr>
             <w:tcW w:w="1539" w:type="dxa"/>
-            <w:vMerge w:val="restart"/>
           </w:tcPr>
           <w:p>
             <w:pPr>
@@ -642,7 +638,6 @@
         <w:tc>
           <w:tcPr>
             <w:tcW w:w="1537" w:type="dxa"/>
-            <w:vMerge w:val="restart"/>
           </w:tcPr>
           <w:p>
             <w:pPr>
@@ -657,7 +652,6 @@
         <w:tc>
           <w:tcPr>
             <w:tcW w:w="1532" w:type="dxa"/>
-            <w:vMerge w:val="restart"/>
           </w:tcPr>
           <w:p>
             <w:pPr>
@@ -672,12 +666,11 @@
       </w:tr>
       <w:tr>
         <w:trPr>
-          <w:trHeight w:val="367"/>
+          <w:trHeight w:val="910"/>
         </w:trPr>
         <w:tc>
           <w:tcPr>
             <w:tcW w:w="1540" w:type="dxa"/>
-            <w:vMerge/>
           </w:tcPr>
           <w:p>
             <w:pPr>
@@ -692,7 +685,6 @@
         <w:tc>
           <w:tcPr>
             <w:tcW w:w="1540" w:type="dxa"/>
-            <w:vMerge/>
           </w:tcPr>
           <w:p>
             <w:pPr>
@@ -707,7 +699,6 @@
         <w:tc>
           <w:tcPr>
             <w:tcW w:w="1539" w:type="dxa"/>
-            <w:vMerge/>
           </w:tcPr>
           <w:p>
             <w:pPr>
@@ -737,7 +728,6 @@
         <w:tc>
           <w:tcPr>
             <w:tcW w:w="1539" w:type="dxa"/>
-            <w:vMerge/>
           </w:tcPr>
           <w:p>
             <w:pPr>
@@ -752,7 +742,6 @@
         <w:tc>
           <w:tcPr>
             <w:tcW w:w="1537" w:type="dxa"/>
-            <w:vMerge/>
           </w:tcPr>
           <w:p>
             <w:pPr>
@@ -767,7 +756,6 @@
         <w:tc>
           <w:tcPr>
             <w:tcW w:w="1532" w:type="dxa"/>
-            <w:vMerge/>
           </w:tcPr>
           <w:p>
             <w:pPr>
@@ -782,12 +770,11 @@
       </w:tr>
       <w:tr>
         <w:trPr>
-          <w:trHeight w:val="450"/>
+          <w:trHeight w:val="910"/>
         </w:trPr>
         <w:tc>
           <w:tcPr>
             <w:tcW w:w="1540" w:type="dxa"/>
-            <w:vMerge w:val="restart"/>
           </w:tcPr>
           <w:p>
             <w:pPr>
@@ -802,7 +789,6 @@
         <w:tc>
           <w:tcPr>
             <w:tcW w:w="1540" w:type="dxa"/>
-            <w:vMerge w:val="restart"/>
           </w:tcPr>
           <w:p>
             <w:pPr>
@@ -817,7 +803,6 @@
         <w:tc>
           <w:tcPr>
             <w:tcW w:w="1539" w:type="dxa"/>
-            <w:vMerge w:val="restart"/>
           </w:tcPr>
           <w:p>
             <w:pPr>
@@ -847,7 +832,6 @@
         <w:tc>
           <w:tcPr>
             <w:tcW w:w="1539" w:type="dxa"/>
-            <w:vMerge w:val="restart"/>
           </w:tcPr>
           <w:p>
             <w:pPr>
@@ -862,7 +846,6 @@
         <w:tc>
           <w:tcPr>
             <w:tcW w:w="1537" w:type="dxa"/>
-            <w:vMerge w:val="restart"/>
           </w:tcPr>
           <w:p>
             <w:pPr>
@@ -877,7 +860,6 @@
         <w:tc>
           <w:tcPr>
             <w:tcW w:w="1532" w:type="dxa"/>
-            <w:vMerge w:val="restart"/>
           </w:tcPr>
           <w:p>
             <w:pPr>
@@ -892,12 +874,11 @@
       </w:tr>
       <w:tr>
         <w:trPr>
-          <w:trHeight w:val="450"/>
+          <w:trHeight w:val="910"/>
         </w:trPr>
         <w:tc>
           <w:tcPr>
             <w:tcW w:w="1540" w:type="dxa"/>
-            <w:vMerge/>
           </w:tcPr>
           <w:p>
             <w:pPr>
@@ -912,7 +893,6 @@
         <w:tc>
           <w:tcPr>
             <w:tcW w:w="1540" w:type="dxa"/>
-            <w:vMerge/>
           </w:tcPr>
           <w:p>
             <w:pPr>
@@ -927,7 +907,6 @@
         <w:tc>
           <w:tcPr>
             <w:tcW w:w="1539" w:type="dxa"/>
-            <w:vMerge/>
           </w:tcPr>
           <w:p>
             <w:pPr>
@@ -957,7 +936,6 @@
         <w:tc>
           <w:tcPr>
             <w:tcW w:w="1539" w:type="dxa"/>
-            <w:vMerge/>
           </w:tcPr>
           <w:p>
             <w:pPr>
@@ -972,7 +950,6 @@
         <w:tc>
           <w:tcPr>
             <w:tcW w:w="1537" w:type="dxa"/>
-            <w:vMerge/>
           </w:tcPr>
           <w:p>
             <w:pPr>
@@ -987,7 +964,6 @@
         <w:tc>
           <w:tcPr>
             <w:tcW w:w="1532" w:type="dxa"/>
-            <w:vMerge/>
           </w:tcPr>
           <w:p>
             <w:pPr>
@@ -1002,12 +978,11 @@
       </w:tr>
       <w:tr>
         <w:trPr>
-          <w:trHeight w:val="450"/>
+          <w:trHeight w:val="910"/>
         </w:trPr>
         <w:tc>
           <w:tcPr>
             <w:tcW w:w="1540" w:type="dxa"/>
-            <w:vMerge w:val="restart"/>
           </w:tcPr>
           <w:p>
             <w:pPr>
@@ -1022,7 +997,6 @@
         <w:tc>
           <w:tcPr>
             <w:tcW w:w="1540" w:type="dxa"/>
-            <w:vMerge w:val="restart"/>
           </w:tcPr>
           <w:p>
             <w:pPr>
@@ -1037,7 +1011,6 @@
         <w:tc>
           <w:tcPr>
             <w:tcW w:w="1539" w:type="dxa"/>
-            <w:vMerge w:val="restart"/>
           </w:tcPr>
           <w:p>
             <w:pPr>
@@ -1067,7 +1040,6 @@
         <w:tc>
           <w:tcPr>
             <w:tcW w:w="1539" w:type="dxa"/>
-            <w:vMerge w:val="restart"/>
           </w:tcPr>
           <w:p>
             <w:pPr>
@@ -1082,7 +1054,6 @@
         <w:tc>
           <w:tcPr>
             <w:tcW w:w="1537" w:type="dxa"/>
-            <w:vMerge w:val="restart"/>
           </w:tcPr>
           <w:p>
             <w:pPr>
@@ -1097,7 +1068,6 @@
         <w:tc>
           <w:tcPr>
             <w:tcW w:w="1532" w:type="dxa"/>
-            <w:vMerge w:val="restart"/>
           </w:tcPr>
           <w:p>
             <w:pPr>
@@ -1112,12 +1082,11 @@
       </w:tr>
       <w:tr>
         <w:trPr>
-          <w:trHeight w:val="450"/>
+          <w:trHeight w:val="910"/>
         </w:trPr>
         <w:tc>
           <w:tcPr>
             <w:tcW w:w="1540" w:type="dxa"/>
-            <w:vMerge/>
           </w:tcPr>
           <w:p>
             <w:pPr>
@@ -1132,7 +1101,6 @@
         <w:tc>
           <w:tcPr>
             <w:tcW w:w="1540" w:type="dxa"/>
-            <w:vMerge/>
           </w:tcPr>
           <w:p>
             <w:pPr>
@@ -1147,7 +1115,6 @@
         <w:tc>
           <w:tcPr>
             <w:tcW w:w="1539" w:type="dxa"/>
-            <w:vMerge/>
           </w:tcPr>
           <w:p>
             <w:pPr>
@@ -1177,7 +1144,6 @@
         <w:tc>
           <w:tcPr>
             <w:tcW w:w="1539" w:type="dxa"/>
-            <w:vMerge/>
           </w:tcPr>
           <w:p>
             <w:pPr>
@@ -1192,7 +1158,6 @@
         <w:tc>
           <w:tcPr>
             <w:tcW w:w="1537" w:type="dxa"/>
-            <w:vMerge/>
           </w:tcPr>
           <w:p>
             <w:pPr>
@@ -1207,667 +1172,6 @@
         <w:tc>
           <w:tcPr>
             <w:tcW w:w="1532" w:type="dxa"/>
-            <w:vMerge/>
-          </w:tcPr>
-          <w:p>
-            <w:pPr>
-              <w:rPr>
-                <w:rFonts w:ascii="Calibri" w:hAnsi="Calibri" w:cs="Calibri"/>
-                <w:sz w:val="20"/>
-                <w:szCs w:val="20"/>
-              </w:rPr>
-            </w:pPr>
-          </w:p>
-        </w:tc>
-      </w:tr>
-      <w:tr>
-        <w:trPr>
-          <w:trHeight w:val="450"/>
-        </w:trPr>
-        <w:tc>
-          <w:tcPr>
-            <w:tcW w:w="1540" w:type="dxa"/>
-            <w:vMerge w:val="restart"/>
-          </w:tcPr>
-          <w:p>
-            <w:pPr>
-              <w:rPr>
-                <w:rFonts w:ascii="Calibri" w:hAnsi="Calibri" w:cs="Calibri"/>
-                <w:sz w:val="20"/>
-                <w:szCs w:val="20"/>
-              </w:rPr>
-            </w:pPr>
-          </w:p>
-        </w:tc>
-        <w:tc>
-          <w:tcPr>
-            <w:tcW w:w="1540" w:type="dxa"/>
-            <w:vMerge w:val="restart"/>
-          </w:tcPr>
-          <w:p>
-            <w:pPr>
-              <w:rPr>
-                <w:rFonts w:ascii="Calibri" w:hAnsi="Calibri" w:cs="Calibri"/>
-                <w:sz w:val="20"/>
-                <w:szCs w:val="20"/>
-              </w:rPr>
-            </w:pPr>
-          </w:p>
-        </w:tc>
-        <w:tc>
-          <w:tcPr>
-            <w:tcW w:w="1539" w:type="dxa"/>
-            <w:vMerge w:val="restart"/>
-          </w:tcPr>
-          <w:p>
-            <w:pPr>
-              <w:rPr>
-                <w:rFonts w:ascii="Calibri" w:hAnsi="Calibri" w:cs="Calibri"/>
-                <w:sz w:val="20"/>
-                <w:szCs w:val="20"/>
-              </w:rPr>
-            </w:pPr>
-          </w:p>
-        </w:tc>
-        <w:tc>
-          <w:tcPr>
-            <w:tcW w:w="1563" w:type="dxa"/>
-            <w:gridSpan w:val="2"/>
-          </w:tcPr>
-          <w:p>
-            <w:pPr>
-              <w:rPr>
-                <w:rFonts w:ascii="Calibri" w:hAnsi="Calibri" w:cs="Calibri"/>
-                <w:sz w:val="20"/>
-                <w:szCs w:val="20"/>
-              </w:rPr>
-            </w:pPr>
-          </w:p>
-        </w:tc>
-        <w:tc>
-          <w:tcPr>
-            <w:tcW w:w="1539" w:type="dxa"/>
-            <w:vMerge w:val="restart"/>
-          </w:tcPr>
-          <w:p>
-            <w:pPr>
-              <w:rPr>
-                <w:rFonts w:ascii="Calibri" w:hAnsi="Calibri" w:cs="Calibri"/>
-                <w:sz w:val="20"/>
-                <w:szCs w:val="20"/>
-              </w:rPr>
-            </w:pPr>
-          </w:p>
-        </w:tc>
-        <w:tc>
-          <w:tcPr>
-            <w:tcW w:w="1537" w:type="dxa"/>
-            <w:vMerge w:val="restart"/>
-          </w:tcPr>
-          <w:p>
-            <w:pPr>
-              <w:rPr>
-                <w:rFonts w:ascii="Calibri" w:hAnsi="Calibri" w:cs="Calibri"/>
-                <w:sz w:val="20"/>
-                <w:szCs w:val="20"/>
-              </w:rPr>
-            </w:pPr>
-          </w:p>
-        </w:tc>
-        <w:tc>
-          <w:tcPr>
-            <w:tcW w:w="1532" w:type="dxa"/>
-            <w:vMerge w:val="restart"/>
-          </w:tcPr>
-          <w:p>
-            <w:pPr>
-              <w:rPr>
-                <w:rFonts w:ascii="Calibri" w:hAnsi="Calibri" w:cs="Calibri"/>
-                <w:sz w:val="20"/>
-                <w:szCs w:val="20"/>
-              </w:rPr>
-            </w:pPr>
-          </w:p>
-        </w:tc>
-      </w:tr>
-      <w:tr>
-        <w:trPr>
-          <w:trHeight w:val="450"/>
-        </w:trPr>
-        <w:tc>
-          <w:tcPr>
-            <w:tcW w:w="1540" w:type="dxa"/>
-            <w:vMerge/>
-          </w:tcPr>
-          <w:p>
-            <w:pPr>
-              <w:rPr>
-                <w:rFonts w:ascii="Calibri" w:hAnsi="Calibri" w:cs="Calibri"/>
-                <w:sz w:val="20"/>
-                <w:szCs w:val="20"/>
-              </w:rPr>
-            </w:pPr>
-          </w:p>
-        </w:tc>
-        <w:tc>
-          <w:tcPr>
-            <w:tcW w:w="1540" w:type="dxa"/>
-            <w:vMerge/>
-          </w:tcPr>
-          <w:p>
-            <w:pPr>
-              <w:rPr>
-                <w:rFonts w:ascii="Calibri" w:hAnsi="Calibri" w:cs="Calibri"/>
-                <w:sz w:val="20"/>
-                <w:szCs w:val="20"/>
-              </w:rPr>
-            </w:pPr>
-          </w:p>
-        </w:tc>
-        <w:tc>
-          <w:tcPr>
-            <w:tcW w:w="1539" w:type="dxa"/>
-            <w:vMerge/>
-          </w:tcPr>
-          <w:p>
-            <w:pPr>
-              <w:rPr>
-                <w:rFonts w:ascii="Calibri" w:hAnsi="Calibri" w:cs="Calibri"/>
-                <w:sz w:val="20"/>
-                <w:szCs w:val="20"/>
-              </w:rPr>
-            </w:pPr>
-          </w:p>
-        </w:tc>
-        <w:tc>
-          <w:tcPr>
-            <w:tcW w:w="1563" w:type="dxa"/>
-            <w:gridSpan w:val="2"/>
-          </w:tcPr>
-          <w:p>
-            <w:pPr>
-              <w:rPr>
-                <w:rFonts w:ascii="Calibri" w:hAnsi="Calibri" w:cs="Calibri"/>
-                <w:sz w:val="20"/>
-                <w:szCs w:val="20"/>
-              </w:rPr>
-            </w:pPr>
-          </w:p>
-        </w:tc>
-        <w:tc>
-          <w:tcPr>
-            <w:tcW w:w="1539" w:type="dxa"/>
-            <w:vMerge/>
-          </w:tcPr>
-          <w:p>
-            <w:pPr>
-              <w:rPr>
-                <w:rFonts w:ascii="Calibri" w:hAnsi="Calibri" w:cs="Calibri"/>
-                <w:sz w:val="20"/>
-                <w:szCs w:val="20"/>
-              </w:rPr>
-            </w:pPr>
-          </w:p>
-        </w:tc>
-        <w:tc>
-          <w:tcPr>
-            <w:tcW w:w="1537" w:type="dxa"/>
-            <w:vMerge/>
-          </w:tcPr>
-          <w:p>
-            <w:pPr>
-              <w:rPr>
-                <w:rFonts w:ascii="Calibri" w:hAnsi="Calibri" w:cs="Calibri"/>
-                <w:sz w:val="20"/>
-                <w:szCs w:val="20"/>
-              </w:rPr>
-            </w:pPr>
-          </w:p>
-        </w:tc>
-        <w:tc>
-          <w:tcPr>
-            <w:tcW w:w="1532" w:type="dxa"/>
-            <w:vMerge/>
-          </w:tcPr>
-          <w:p>
-            <w:pPr>
-              <w:rPr>
-                <w:rFonts w:ascii="Calibri" w:hAnsi="Calibri" w:cs="Calibri"/>
-                <w:sz w:val="20"/>
-                <w:szCs w:val="20"/>
-              </w:rPr>
-            </w:pPr>
-          </w:p>
-        </w:tc>
-      </w:tr>
-      <w:tr>
-        <w:trPr>
-          <w:trHeight w:val="450"/>
-        </w:trPr>
-        <w:tc>
-          <w:tcPr>
-            <w:tcW w:w="1540" w:type="dxa"/>
-            <w:vMerge w:val="restart"/>
-          </w:tcPr>
-          <w:p>
-            <w:pPr>
-              <w:rPr>
-                <w:rFonts w:ascii="Calibri" w:hAnsi="Calibri" w:cs="Calibri"/>
-                <w:sz w:val="20"/>
-                <w:szCs w:val="20"/>
-              </w:rPr>
-            </w:pPr>
-          </w:p>
-        </w:tc>
-        <w:tc>
-          <w:tcPr>
-            <w:tcW w:w="1540" w:type="dxa"/>
-            <w:vMerge w:val="restart"/>
-          </w:tcPr>
-          <w:p>
-            <w:pPr>
-              <w:rPr>
-                <w:rFonts w:ascii="Calibri" w:hAnsi="Calibri" w:cs="Calibri"/>
-                <w:sz w:val="20"/>
-                <w:szCs w:val="20"/>
-              </w:rPr>
-            </w:pPr>
-          </w:p>
-        </w:tc>
-        <w:tc>
-          <w:tcPr>
-            <w:tcW w:w="1539" w:type="dxa"/>
-            <w:vMerge w:val="restart"/>
-          </w:tcPr>
-          <w:p>
-            <w:pPr>
-              <w:rPr>
-                <w:rFonts w:ascii="Calibri" w:hAnsi="Calibri" w:cs="Calibri"/>
-                <w:sz w:val="20"/>
-                <w:szCs w:val="20"/>
-              </w:rPr>
-            </w:pPr>
-          </w:p>
-        </w:tc>
-        <w:tc>
-          <w:tcPr>
-            <w:tcW w:w="1563" w:type="dxa"/>
-            <w:gridSpan w:val="2"/>
-          </w:tcPr>
-          <w:p>
-            <w:pPr>
-              <w:rPr>
-                <w:rFonts w:ascii="Calibri" w:hAnsi="Calibri" w:cs="Calibri"/>
-                <w:sz w:val="20"/>
-                <w:szCs w:val="20"/>
-              </w:rPr>
-            </w:pPr>
-          </w:p>
-        </w:tc>
-        <w:tc>
-          <w:tcPr>
-            <w:tcW w:w="1539" w:type="dxa"/>
-            <w:vMerge w:val="restart"/>
-          </w:tcPr>
-          <w:p>
-            <w:pPr>
-              <w:rPr>
-                <w:rFonts w:ascii="Calibri" w:hAnsi="Calibri" w:cs="Calibri"/>
-                <w:sz w:val="20"/>
-                <w:szCs w:val="20"/>
-              </w:rPr>
-            </w:pPr>
-          </w:p>
-        </w:tc>
-        <w:tc>
-          <w:tcPr>
-            <w:tcW w:w="1537" w:type="dxa"/>
-            <w:vMerge w:val="restart"/>
-          </w:tcPr>
-          <w:p>
-            <w:pPr>
-              <w:rPr>
-                <w:rFonts w:ascii="Calibri" w:hAnsi="Calibri" w:cs="Calibri"/>
-                <w:sz w:val="20"/>
-                <w:szCs w:val="20"/>
-              </w:rPr>
-            </w:pPr>
-          </w:p>
-        </w:tc>
-        <w:tc>
-          <w:tcPr>
-            <w:tcW w:w="1532" w:type="dxa"/>
-            <w:vMerge w:val="restart"/>
-          </w:tcPr>
-          <w:p>
-            <w:pPr>
-              <w:rPr>
-                <w:rFonts w:ascii="Calibri" w:hAnsi="Calibri" w:cs="Calibri"/>
-                <w:sz w:val="20"/>
-                <w:szCs w:val="20"/>
-              </w:rPr>
-            </w:pPr>
-          </w:p>
-        </w:tc>
-      </w:tr>
-      <w:tr>
-        <w:trPr>
-          <w:trHeight w:val="450"/>
-        </w:trPr>
-        <w:tc>
-          <w:tcPr>
-            <w:tcW w:w="1540" w:type="dxa"/>
-            <w:vMerge/>
-          </w:tcPr>
-          <w:p>
-            <w:pPr>
-              <w:rPr>
-                <w:rFonts w:ascii="Calibri" w:hAnsi="Calibri" w:cs="Calibri"/>
-                <w:sz w:val="20"/>
-                <w:szCs w:val="20"/>
-              </w:rPr>
-            </w:pPr>
-          </w:p>
-        </w:tc>
-        <w:tc>
-          <w:tcPr>
-            <w:tcW w:w="1540" w:type="dxa"/>
-            <w:vMerge/>
-          </w:tcPr>
-          <w:p>
-            <w:pPr>
-              <w:rPr>
-                <w:rFonts w:ascii="Calibri" w:hAnsi="Calibri" w:cs="Calibri"/>
-                <w:sz w:val="20"/>
-                <w:szCs w:val="20"/>
-              </w:rPr>
-            </w:pPr>
-          </w:p>
-        </w:tc>
-        <w:tc>
-          <w:tcPr>
-            <w:tcW w:w="1539" w:type="dxa"/>
-            <w:vMerge/>
-          </w:tcPr>
-          <w:p>
-            <w:pPr>
-              <w:rPr>
-                <w:rFonts w:ascii="Calibri" w:hAnsi="Calibri" w:cs="Calibri"/>
-                <w:sz w:val="20"/>
-                <w:szCs w:val="20"/>
-              </w:rPr>
-            </w:pPr>
-          </w:p>
-        </w:tc>
-        <w:tc>
-          <w:tcPr>
-            <w:tcW w:w="1563" w:type="dxa"/>
-            <w:gridSpan w:val="2"/>
-          </w:tcPr>
-          <w:p>
-            <w:pPr>
-              <w:rPr>
-                <w:rFonts w:ascii="Calibri" w:hAnsi="Calibri" w:cs="Calibri"/>
-                <w:sz w:val="20"/>
-                <w:szCs w:val="20"/>
-              </w:rPr>
-            </w:pPr>
-          </w:p>
-        </w:tc>
-        <w:tc>
-          <w:tcPr>
-            <w:tcW w:w="1539" w:type="dxa"/>
-            <w:vMerge/>
-          </w:tcPr>
-          <w:p>
-            <w:pPr>
-              <w:rPr>
-                <w:rFonts w:ascii="Calibri" w:hAnsi="Calibri" w:cs="Calibri"/>
-                <w:sz w:val="20"/>
-                <w:szCs w:val="20"/>
-              </w:rPr>
-            </w:pPr>
-          </w:p>
-        </w:tc>
-        <w:tc>
-          <w:tcPr>
-            <w:tcW w:w="1537" w:type="dxa"/>
-            <w:vMerge/>
-          </w:tcPr>
-          <w:p>
-            <w:pPr>
-              <w:rPr>
-                <w:rFonts w:ascii="Calibri" w:hAnsi="Calibri" w:cs="Calibri"/>
-                <w:sz w:val="20"/>
-                <w:szCs w:val="20"/>
-              </w:rPr>
-            </w:pPr>
-          </w:p>
-        </w:tc>
-        <w:tc>
-          <w:tcPr>
-            <w:tcW w:w="1532" w:type="dxa"/>
-            <w:vMerge/>
-          </w:tcPr>
-          <w:p>
-            <w:pPr>
-              <w:rPr>
-                <w:rFonts w:ascii="Calibri" w:hAnsi="Calibri" w:cs="Calibri"/>
-                <w:sz w:val="20"/>
-                <w:szCs w:val="20"/>
-              </w:rPr>
-            </w:pPr>
-          </w:p>
-        </w:tc>
-      </w:tr>
-      <w:tr>
-        <w:trPr>
-          <w:trHeight w:val="450"/>
-        </w:trPr>
-        <w:tc>
-          <w:tcPr>
-            <w:tcW w:w="1540" w:type="dxa"/>
-            <w:vMerge w:val="restart"/>
-          </w:tcPr>
-          <w:p>
-            <w:pPr>
-              <w:rPr>
-                <w:rFonts w:ascii="Calibri" w:hAnsi="Calibri" w:cs="Calibri"/>
-                <w:sz w:val="20"/>
-                <w:szCs w:val="20"/>
-              </w:rPr>
-            </w:pPr>
-          </w:p>
-        </w:tc>
-        <w:tc>
-          <w:tcPr>
-            <w:tcW w:w="1540" w:type="dxa"/>
-            <w:vMerge w:val="restart"/>
-          </w:tcPr>
-          <w:p>
-            <w:pPr>
-              <w:rPr>
-                <w:rFonts w:ascii="Calibri" w:hAnsi="Calibri" w:cs="Calibri"/>
-                <w:sz w:val="20"/>
-                <w:szCs w:val="20"/>
-              </w:rPr>
-            </w:pPr>
-          </w:p>
-        </w:tc>
-        <w:tc>
-          <w:tcPr>
-            <w:tcW w:w="1539" w:type="dxa"/>
-            <w:vMerge w:val="restart"/>
-          </w:tcPr>
-          <w:p>
-            <w:pPr>
-              <w:rPr>
-                <w:rFonts w:ascii="Calibri" w:hAnsi="Calibri" w:cs="Calibri"/>
-                <w:sz w:val="20"/>
-                <w:szCs w:val="20"/>
-              </w:rPr>
-            </w:pPr>
-          </w:p>
-        </w:tc>
-        <w:tc>
-          <w:tcPr>
-            <w:tcW w:w="1563" w:type="dxa"/>
-            <w:gridSpan w:val="2"/>
-          </w:tcPr>
-          <w:p>
-            <w:pPr>
-              <w:rPr>
-                <w:rFonts w:ascii="Calibri" w:hAnsi="Calibri" w:cs="Calibri"/>
-                <w:sz w:val="20"/>
-                <w:szCs w:val="20"/>
-              </w:rPr>
-            </w:pPr>
-          </w:p>
-        </w:tc>
-        <w:tc>
-          <w:tcPr>
-            <w:tcW w:w="1539" w:type="dxa"/>
-            <w:vMerge w:val="restart"/>
-          </w:tcPr>
-          <w:p>
-            <w:pPr>
-              <w:rPr>
-                <w:rFonts w:ascii="Calibri" w:hAnsi="Calibri" w:cs="Calibri"/>
-                <w:sz w:val="20"/>
-                <w:szCs w:val="20"/>
-              </w:rPr>
-            </w:pPr>
-          </w:p>
-        </w:tc>
-        <w:tc>
-          <w:tcPr>
-            <w:tcW w:w="1537" w:type="dxa"/>
-            <w:vMerge w:val="restart"/>
-          </w:tcPr>
-          <w:p>
-            <w:pPr>
-              <w:rPr>
-                <w:rFonts w:ascii="Calibri" w:hAnsi="Calibri" w:cs="Calibri"/>
-                <w:sz w:val="20"/>
-                <w:szCs w:val="20"/>
-              </w:rPr>
-            </w:pPr>
-          </w:p>
-        </w:tc>
-        <w:tc>
-          <w:tcPr>
-            <w:tcW w:w="1532" w:type="dxa"/>
-            <w:vMerge w:val="restart"/>
-          </w:tcPr>
-          <w:p>
-            <w:pPr>
-              <w:rPr>
-                <w:rFonts w:ascii="Calibri" w:hAnsi="Calibri" w:cs="Calibri"/>
-                <w:sz w:val="20"/>
-                <w:szCs w:val="20"/>
-              </w:rPr>
-            </w:pPr>
-          </w:p>
-        </w:tc>
-      </w:tr>
-      <w:tr>
-        <w:trPr>
-          <w:trHeight w:val="450"/>
-        </w:trPr>
-        <w:tc>
-          <w:tcPr>
-            <w:tcW w:w="1540" w:type="dxa"/>
-            <w:vMerge/>
-          </w:tcPr>
-          <w:p>
-            <w:pPr>
-              <w:rPr>
-                <w:rFonts w:ascii="Calibri" w:hAnsi="Calibri" w:cs="Calibri"/>
-                <w:sz w:val="20"/>
-                <w:szCs w:val="20"/>
-              </w:rPr>
-            </w:pPr>
-          </w:p>
-        </w:tc>
-        <w:tc>
-          <w:tcPr>
-            <w:tcW w:w="1540" w:type="dxa"/>
-            <w:vMerge/>
-          </w:tcPr>
-          <w:p>
-            <w:pPr>
-              <w:rPr>
-                <w:rFonts w:ascii="Calibri" w:hAnsi="Calibri" w:cs="Calibri"/>
-                <w:sz w:val="20"/>
-                <w:szCs w:val="20"/>
-              </w:rPr>
-            </w:pPr>
-          </w:p>
-        </w:tc>
-        <w:tc>
-          <w:tcPr>
-            <w:tcW w:w="1539" w:type="dxa"/>
-            <w:vMerge/>
-          </w:tcPr>
-          <w:p>
-            <w:pPr>
-              <w:rPr>
-                <w:rFonts w:ascii="Calibri" w:hAnsi="Calibri" w:cs="Calibri"/>
-                <w:sz w:val="20"/>
-                <w:szCs w:val="20"/>
-              </w:rPr>
-            </w:pPr>
-          </w:p>
-        </w:tc>
-        <w:tc>
-          <w:tcPr>
-            <w:tcW w:w="1563" w:type="dxa"/>
-            <w:gridSpan w:val="2"/>
-          </w:tcPr>
-          <w:p>
-            <w:pPr>
-              <w:rPr>
-                <w:rFonts w:ascii="Calibri" w:hAnsi="Calibri" w:cs="Calibri"/>
-                <w:sz w:val="20"/>
-                <w:szCs w:val="20"/>
-              </w:rPr>
-            </w:pPr>
-          </w:p>
-        </w:tc>
-        <w:tc>
-          <w:tcPr>
-            <w:tcW w:w="1539" w:type="dxa"/>
-            <w:vMerge/>
-          </w:tcPr>
-          <w:p>
-            <w:pPr>
-              <w:rPr>
-                <w:rFonts w:ascii="Calibri" w:hAnsi="Calibri" w:cs="Calibri"/>
-                <w:sz w:val="20"/>
-                <w:szCs w:val="20"/>
-              </w:rPr>
-            </w:pPr>
-          </w:p>
-        </w:tc>
-        <w:tc>
-          <w:tcPr>
-            <w:tcW w:w="1537" w:type="dxa"/>
-            <w:vMerge/>
-          </w:tcPr>
-          <w:p>
-            <w:pPr>
-              <w:rPr>
-                <w:rFonts w:ascii="Calibri" w:hAnsi="Calibri" w:cs="Calibri"/>
-                <w:sz w:val="20"/>
-                <w:szCs w:val="20"/>
-              </w:rPr>
-            </w:pPr>
-          </w:p>
-        </w:tc>
-        <w:tc>
-          <w:tcPr>
-            <w:tcW w:w="1532" w:type="dxa"/>
-            <w:vMerge/>
           </w:tcPr>
           <w:p>
             <w:pPr>
@@ -4228,6 +3532,17 @@
               </w:rPr>
               <w:t>Packaging</w:t>
             </w:r>
+            <w:r>
+              <w:rPr>
+                <w:rFonts w:ascii="Calibri" w:hAnsi="Calibri" w:cs="Calibri"/>
+                <w:b/>
+                <w:bCs/>
+                <w:sz w:val="20"/>
+                <w:szCs w:val="20"/>
+              </w:rPr>
+              <w:br/>
+              <w:t>(Indirect materials)</w:t>
+            </w:r>
           </w:p>
         </w:tc>
         <w:tc>
@@ -5299,12 +4614,8 @@
       </w:r>
     </w:p>
     <w:sectPr>
-      <w:headerReference w:type="even" r:id="rId9"/>
-      <w:headerReference w:type="default" r:id="rId10"/>
-      <w:footerReference w:type="even" r:id="rId11"/>
-      <w:footerReference w:type="default" r:id="rId12"/>
-      <w:headerReference w:type="first" r:id="rId13"/>
-      <w:footerReference w:type="first" r:id="rId14"/>
+      <w:headerReference w:type="default" r:id="rId9"/>
+      <w:footerReference w:type="default" r:id="rId10"/>
       <w:pgSz w:w="12240" w:h="15840"/>
       <w:pgMar w:top="720" w:right="720" w:bottom="720" w:left="720" w:header="720" w:footer="720" w:gutter="0"/>
       <w:cols w:space="720"/>
@@ -5338,16 +4649,6 @@
   <w:p>
     <w:pPr>
       <w:pStyle w:val="Footer"/>
-    </w:pPr>
-  </w:p>
-</w:ftr>
-</file>
-
-<file path=word/footer2.xml><?xml version="1.0" encoding="utf-8"?>
-<w:ftr xmlns:wpc="http://schemas.microsoft.com/office/word/2010/wordprocessingCanvas" xmlns:cx="http://schemas.microsoft.com/office/drawing/2014/chartex" xmlns:cx1="http://schemas.microsoft.com/office/drawing/2015/9/8/chartex" xmlns:cx2="http://schemas.microsoft.com/office/drawing/2015/10/21/chartex" xmlns:cx3="http://schemas.microsoft.com/office/drawing/2016/5/9/chartex" xmlns:cx4="http://schemas.microsoft.com/office/drawing/2016/5/10/chartex" xmlns:cx5="http://schemas.microsoft.com/office/drawing/2016/5/11/chartex" xmlns:cx6="http://schemas.microsoft.com/office/drawing/2016/5/12/chartex" xmlns:cx7="http://schemas.microsoft.com/office/drawing/2016/5/13/chartex" xmlns:cx8="http://schemas.microsoft.com/office/drawing/2016/5/14/chartex" xmlns:mc="http://schemas.openxmlformats.org/markup-compatibility/2006" xmlns:aink="http://schemas.microsoft.com/office/drawing/2016/ink" xmlns:am3d="http://schemas.microsoft.com/office/drawing/2017/model3d" xmlns:o="urn:schemas-microsoft-com:office:office" xmlns:oel="http://schemas.microsoft.com/office/2019/extlst" xmlns:r="http://schemas.openxmlformats.org/officeDocument/2006/relationships" xmlns:m="http://schemas.openxmlformats.org/officeDocument/2006/math" xmlns:v="urn:schemas-microsoft-com:vml" xmlns:wp14="http://schemas.microsoft.com/office/word/2010/wordprocessingDrawing" xmlns:wp="http://schemas.openxmlformats.org/drawingml/2006/wordprocessingDrawing" xmlns:w10="urn:schemas-microsoft-com:office:word" xmlns:w="http://schemas.openxmlformats.org/wordprocessingml/2006/main" xmlns:w14="http://schemas.microsoft.com/office/word/2010/wordml" xmlns:w15="http://schemas.microsoft.com/office/word/2012/wordml" xmlns:w16cex="http://schemas.microsoft.com/office/word/2018/wordml/cex" xmlns:w16cid="http://schemas.microsoft.com/office/word/2016/wordml/cid" xmlns:w16="http://schemas.microsoft.com/office/word/2018/wordml" xmlns:w16du="http://schemas.microsoft.com/office/word/2023/wordml/word16du" xmlns:w16sdtdh="http://schemas.microsoft.com/office/word/2020/wordml/sdtdatahash" xmlns:w16sdtfl="http://schemas.microsoft.com/office/word/2024/wordml/sdtformatlock" xmlns:w16se="http://schemas.microsoft.com/office/word/2015/wordml/symex" xmlns:wpg="http://schemas.microsoft.com/office/word/2010/wordprocessingGroup" xmlns:wpi="http://schemas.microsoft.com/office/word/2010/wordprocessingInk" xmlns:wne="http://schemas.microsoft.com/office/word/2006/wordml" xmlns:wps="http://schemas.microsoft.com/office/word/2010/wordprocessingShape" mc:Ignorable="w14 w15 w16se w16cid w16 w16cex w16sdtdh w16sdtfl w16du wp14">
-  <w:p>
-    <w:pPr>
-      <w:pStyle w:val="Footer"/>
       <w:jc w:val="center"/>
       <w:rPr>
         <w:i/>
@@ -5355,125 +4656,6 @@
         <w:sz w:val="16"/>
         <w:szCs w:val="16"/>
       </w:rPr>
-    </w:pPr>
-    <w:r>
-      <w:rPr>
-        <w:i/>
-        <w:iCs/>
-        <w:sz w:val="16"/>
-        <w:szCs w:val="16"/>
-      </w:rPr>
-      <w:t>This document contains confidential and proprietary information intended solely for the recipient. By accepting this document, you agree to maintain the confidentiality of its contents and not to disclose, distribute, or use any information herein for purposes other than those expressly authorized. Unauthorized use or disclosure may result in legal action. If you are not the intended recipient, please notify the sender immediately and delete this document from your system.</w:t>
-    </w:r>
-    <w:r>
-      <w:rPr>
-        <w:i/>
-        <w:iCs/>
-        <w:sz w:val="16"/>
-        <w:szCs w:val="16"/>
-      </w:rPr>
-      <w:br/>
-    </w:r>
-    <w:r>
-      <w:rPr>
-        <w:i/>
-        <w:iCs/>
-        <w:sz w:val="16"/>
-        <w:szCs w:val="16"/>
-      </w:rPr>
-      <w:br/>
-      <w:t xml:space="preserve">Batch Ticket – Updated </w:t>
-    </w:r>
-    <w:r>
-      <w:rPr>
-        <w:i/>
-        <w:iCs/>
-        <w:sz w:val="16"/>
-        <w:szCs w:val="16"/>
-      </w:rPr>
-      <w:t>02</w:t>
-    </w:r>
-    <w:r>
-      <w:rPr>
-        <w:i/>
-        <w:iCs/>
-        <w:sz w:val="16"/>
-        <w:szCs w:val="16"/>
-      </w:rPr>
-      <w:t>/</w:t>
-    </w:r>
-    <w:r>
-      <w:rPr>
-        <w:i/>
-        <w:iCs/>
-        <w:sz w:val="16"/>
-        <w:szCs w:val="16"/>
-      </w:rPr>
-      <w:t>0</w:t>
-    </w:r>
-    <w:r>
-      <w:rPr>
-        <w:i/>
-        <w:iCs/>
-        <w:sz w:val="16"/>
-        <w:szCs w:val="16"/>
-      </w:rPr>
-      <w:t>6</w:t>
-    </w:r>
-    <w:r>
-      <w:rPr>
-        <w:i/>
-        <w:iCs/>
-        <w:sz w:val="16"/>
-        <w:szCs w:val="16"/>
-      </w:rPr>
-      <w:t>/202</w:t>
-    </w:r>
-    <w:r>
-      <w:rPr>
-        <w:i/>
-        <w:iCs/>
-        <w:sz w:val="16"/>
-        <w:szCs w:val="16"/>
-      </w:rPr>
-      <w:t>6</w:t>
-    </w:r>
-    <w:r>
-      <w:rPr>
-        <w:i/>
-        <w:iCs/>
-        <w:sz w:val="16"/>
-        <w:szCs w:val="16"/>
-      </w:rPr>
-      <w:t xml:space="preserve"> (GDM) – Reviewed by GM – Effective Date </w:t>
-    </w:r>
-    <w:r>
-      <w:rPr>
-        <w:i/>
-        <w:iCs/>
-        <w:sz w:val="16"/>
-        <w:szCs w:val="16"/>
-      </w:rPr>
-      <w:t>02/06/2026</w:t>
-    </w:r>
-    <w:r>
-      <w:rPr>
-        <w:i/>
-        <w:iCs/>
-        <w:sz w:val="16"/>
-        <w:szCs w:val="16"/>
-      </w:rPr>
-      <w:t xml:space="preserve"> (BP-13)</w:t>
-    </w:r>
-  </w:p>
-</w:ftr>
-</file>
-
-<file path=word/footer3.xml><?xml version="1.0" encoding="utf-8"?>
-<w:ftr xmlns:wpc="http://schemas.microsoft.com/office/word/2010/wordprocessingCanvas" xmlns:cx="http://schemas.microsoft.com/office/drawing/2014/chartex" xmlns:cx1="http://schemas.microsoft.com/office/drawing/2015/9/8/chartex" xmlns:cx2="http://schemas.microsoft.com/office/drawing/2015/10/21/chartex" xmlns:cx3="http://schemas.microsoft.com/office/drawing/2016/5/9/chartex" xmlns:cx4="http://schemas.microsoft.com/office/drawing/2016/5/10/chartex" xmlns:cx5="http://schemas.microsoft.com/office/drawing/2016/5/11/chartex" xmlns:cx6="http://schemas.microsoft.com/office/drawing/2016/5/12/chartex" xmlns:cx7="http://schemas.microsoft.com/office/drawing/2016/5/13/chartex" xmlns:cx8="http://schemas.microsoft.com/office/drawing/2016/5/14/chartex" xmlns:mc="http://schemas.openxmlformats.org/markup-compatibility/2006" xmlns:aink="http://schemas.microsoft.com/office/drawing/2016/ink" xmlns:am3d="http://schemas.microsoft.com/office/drawing/2017/model3d" xmlns:o="urn:schemas-microsoft-com:office:office" xmlns:oel="http://schemas.microsoft.com/office/2019/extlst" xmlns:r="http://schemas.openxmlformats.org/officeDocument/2006/relationships" xmlns:m="http://schemas.openxmlformats.org/officeDocument/2006/math" xmlns:v="urn:schemas-microsoft-com:vml" xmlns:wp14="http://schemas.microsoft.com/office/word/2010/wordprocessingDrawing" xmlns:wp="http://schemas.openxmlformats.org/drawingml/2006/wordprocessingDrawing" xmlns:w10="urn:schemas-microsoft-com:office:word" xmlns:w="http://schemas.openxmlformats.org/wordprocessingml/2006/main" xmlns:w14="http://schemas.microsoft.com/office/word/2010/wordml" xmlns:w15="http://schemas.microsoft.com/office/word/2012/wordml" xmlns:w16cex="http://schemas.microsoft.com/office/word/2018/wordml/cex" xmlns:w16cid="http://schemas.microsoft.com/office/word/2016/wordml/cid" xmlns:w16="http://schemas.microsoft.com/office/word/2018/wordml" xmlns:w16du="http://schemas.microsoft.com/office/word/2023/wordml/word16du" xmlns:w16sdtdh="http://schemas.microsoft.com/office/word/2020/wordml/sdtdatahash" xmlns:w16sdtfl="http://schemas.microsoft.com/office/word/2024/wordml/sdtformatlock" xmlns:w16se="http://schemas.microsoft.com/office/word/2015/wordml/symex" xmlns:wpg="http://schemas.microsoft.com/office/word/2010/wordprocessingGroup" xmlns:wpi="http://schemas.microsoft.com/office/word/2010/wordprocessingInk" xmlns:wne="http://schemas.microsoft.com/office/word/2006/wordml" xmlns:wps="http://schemas.microsoft.com/office/word/2010/wordprocessingShape" mc:Ignorable="w14 w15 w16se w16cid w16 w16cex w16sdtdh w16sdtfl w16du wp14">
-  <w:p>
-    <w:pPr>
-      <w:pStyle w:val="Footer"/>
     </w:pPr>
   </w:p>
 </w:ftr>
@@ -5499,16 +4681,6 @@
 </file>
 
 <file path=word/header1.xml><?xml version="1.0" encoding="utf-8"?>
-<w:hdr xmlns:wpc="http://schemas.microsoft.com/office/word/2010/wordprocessingCanvas" xmlns:cx="http://schemas.microsoft.com/office/drawing/2014/chartex" xmlns:cx1="http://schemas.microsoft.com/office/drawing/2015/9/8/chartex" xmlns:cx2="http://schemas.microsoft.com/office/drawing/2015/10/21/chartex" xmlns:cx3="http://schemas.microsoft.com/office/drawing/2016/5/9/chartex" xmlns:cx4="http://schemas.microsoft.com/office/drawing/2016/5/10/chartex" xmlns:cx5="http://schemas.microsoft.com/office/drawing/2016/5/11/chartex" xmlns:cx6="http://schemas.microsoft.com/office/drawing/2016/5/12/chartex" xmlns:cx7="http://schemas.microsoft.com/office/drawing/2016/5/13/chartex" xmlns:cx8="http://schemas.microsoft.com/office/drawing/2016/5/14/chartex" xmlns:mc="http://schemas.openxmlformats.org/markup-compatibility/2006" xmlns:aink="http://schemas.microsoft.com/office/drawing/2016/ink" xmlns:am3d="http://schemas.microsoft.com/office/drawing/2017/model3d" xmlns:o="urn:schemas-microsoft-com:office:office" xmlns:oel="http://schemas.microsoft.com/office/2019/extlst" xmlns:r="http://schemas.openxmlformats.org/officeDocument/2006/relationships" xmlns:m="http://schemas.openxmlformats.org/officeDocument/2006/math" xmlns:v="urn:schemas-microsoft-com:vml" xmlns:wp14="http://schemas.microsoft.com/office/word/2010/wordprocessingDrawing" xmlns:wp="http://schemas.openxmlformats.org/drawingml/2006/wordprocessingDrawing" xmlns:w10="urn:schemas-microsoft-com:office:word" xmlns:w="http://schemas.openxmlformats.org/wordprocessingml/2006/main" xmlns:w14="http://schemas.microsoft.com/office/word/2010/wordml" xmlns:w15="http://schemas.microsoft.com/office/word/2012/wordml" xmlns:w16cex="http://schemas.microsoft.com/office/word/2018/wordml/cex" xmlns:w16cid="http://schemas.microsoft.com/office/word/2016/wordml/cid" xmlns:w16="http://schemas.microsoft.com/office/word/2018/wordml" xmlns:w16du="http://schemas.microsoft.com/office/word/2023/wordml/word16du" xmlns:w16sdtdh="http://schemas.microsoft.com/office/word/2020/wordml/sdtdatahash" xmlns:w16sdtfl="http://schemas.microsoft.com/office/word/2024/wordml/sdtformatlock" xmlns:w16se="http://schemas.microsoft.com/office/word/2015/wordml/symex" xmlns:wpg="http://schemas.microsoft.com/office/word/2010/wordprocessingGroup" xmlns:wpi="http://schemas.microsoft.com/office/word/2010/wordprocessingInk" xmlns:wne="http://schemas.microsoft.com/office/word/2006/wordml" xmlns:wps="http://schemas.microsoft.com/office/word/2010/wordprocessingShape" mc:Ignorable="w14 w15 w16se w16cid w16 w16cex w16sdtdh w16sdtfl w16du wp14">
-  <w:p>
-    <w:pPr>
-      <w:pStyle w:val="Header"/>
-    </w:pPr>
-  </w:p>
-</w:hdr>
-</file>
-
-<file path=word/header2.xml><?xml version="1.0" encoding="utf-8"?>
 <w:hdr xmlns:wpc="http://schemas.microsoft.com/office/word/2010/wordprocessingCanvas" xmlns:cx="http://schemas.microsoft.com/office/drawing/2014/chartex" xmlns:cx1="http://schemas.microsoft.com/office/drawing/2015/9/8/chartex" xmlns:cx2="http://schemas.microsoft.com/office/drawing/2015/10/21/chartex" xmlns:cx3="http://schemas.microsoft.com/office/drawing/2016/5/9/chartex" xmlns:cx4="http://schemas.microsoft.com/office/drawing/2016/5/10/chartex" xmlns:cx5="http://schemas.microsoft.com/office/drawing/2016/5/11/chartex" xmlns:cx6="http://schemas.microsoft.com/office/drawing/2016/5/12/chartex" xmlns:cx7="http://schemas.microsoft.com/office/drawing/2016/5/13/chartex" xmlns:cx8="http://schemas.microsoft.com/office/drawing/2016/5/14/chartex" xmlns:mc="http://schemas.openxmlformats.org/markup-compatibility/2006" xmlns:aink="http://schemas.microsoft.com/office/drawing/2016/ink" xmlns:am3d="http://schemas.microsoft.com/office/drawing/2017/model3d" xmlns:o="urn:schemas-microsoft-com:office:office" xmlns:oel="http://schemas.microsoft.com/office/2019/extlst" xmlns:r="http://schemas.openxmlformats.org/officeDocument/2006/relationships" xmlns:m="http://schemas.openxmlformats.org/officeDocument/2006/math" xmlns:v="urn:schemas-microsoft-com:vml" xmlns:wp14="http://schemas.microsoft.com/office/word/2010/wordprocessingDrawing" xmlns:wp="http://schemas.openxmlformats.org/drawingml/2006/wordprocessingDrawing" xmlns:w10="urn:schemas-microsoft-com:office:word" xmlns:w="http://schemas.openxmlformats.org/wordprocessingml/2006/main" xmlns:w14="http://schemas.microsoft.com/office/word/2010/wordml" xmlns:w15="http://schemas.microsoft.com/office/word/2012/wordml" xmlns:w16cex="http://schemas.microsoft.com/office/word/2018/wordml/cex" xmlns:w16cid="http://schemas.microsoft.com/office/word/2016/wordml/cid" xmlns:w16="http://schemas.microsoft.com/office/word/2018/wordml" xmlns:w16du="http://schemas.microsoft.com/office/word/2023/wordml/word16du" xmlns:w16sdtdh="http://schemas.microsoft.com/office/word/2020/wordml/sdtdatahash" xmlns:w16sdtfl="http://schemas.microsoft.com/office/word/2024/wordml/sdtformatlock" xmlns:w16se="http://schemas.microsoft.com/office/word/2015/wordml/symex" xmlns:wpg="http://schemas.microsoft.com/office/word/2010/wordprocessingGroup" xmlns:wpi="http://schemas.microsoft.com/office/word/2010/wordprocessingInk" xmlns:wne="http://schemas.microsoft.com/office/word/2006/wordml" xmlns:wps="http://schemas.microsoft.com/office/word/2010/wordprocessingShape" mc:Ignorable="w14 w15 w16se w16cid w16 w16cex w16sdtdh w16sdtfl w16du wp14">
   <w:p>
     <w:pPr>
@@ -6074,16 +5246,6 @@
       </w:rPr>
       <w:tab/>
     </w:r>
-  </w:p>
-</w:hdr>
-</file>
-
-<file path=word/header3.xml><?xml version="1.0" encoding="utf-8"?>
-<w:hdr xmlns:wpc="http://schemas.microsoft.com/office/word/2010/wordprocessingCanvas" xmlns:cx="http://schemas.microsoft.com/office/drawing/2014/chartex" xmlns:cx1="http://schemas.microsoft.com/office/drawing/2015/9/8/chartex" xmlns:cx2="http://schemas.microsoft.com/office/drawing/2015/10/21/chartex" xmlns:cx3="http://schemas.microsoft.com/office/drawing/2016/5/9/chartex" xmlns:cx4="http://schemas.microsoft.com/office/drawing/2016/5/10/chartex" xmlns:cx5="http://schemas.microsoft.com/office/drawing/2016/5/11/chartex" xmlns:cx6="http://schemas.microsoft.com/office/drawing/2016/5/12/chartex" xmlns:cx7="http://schemas.microsoft.com/office/drawing/2016/5/13/chartex" xmlns:cx8="http://schemas.microsoft.com/office/drawing/2016/5/14/chartex" xmlns:mc="http://schemas.openxmlformats.org/markup-compatibility/2006" xmlns:aink="http://schemas.microsoft.com/office/drawing/2016/ink" xmlns:am3d="http://schemas.microsoft.com/office/drawing/2017/model3d" xmlns:o="urn:schemas-microsoft-com:office:office" xmlns:oel="http://schemas.microsoft.com/office/2019/extlst" xmlns:r="http://schemas.openxmlformats.org/officeDocument/2006/relationships" xmlns:m="http://schemas.openxmlformats.org/officeDocument/2006/math" xmlns:v="urn:schemas-microsoft-com:vml" xmlns:wp14="http://schemas.microsoft.com/office/word/2010/wordprocessingDrawing" xmlns:wp="http://schemas.openxmlformats.org/drawingml/2006/wordprocessingDrawing" xmlns:w10="urn:schemas-microsoft-com:office:word" xmlns:w="http://schemas.openxmlformats.org/wordprocessingml/2006/main" xmlns:w14="http://schemas.microsoft.com/office/word/2010/wordml" xmlns:w15="http://schemas.microsoft.com/office/word/2012/wordml" xmlns:w16cex="http://schemas.microsoft.com/office/word/2018/wordml/cex" xmlns:w16cid="http://schemas.microsoft.com/office/word/2016/wordml/cid" xmlns:w16="http://schemas.microsoft.com/office/word/2018/wordml" xmlns:w16du="http://schemas.microsoft.com/office/word/2023/wordml/word16du" xmlns:w16sdtdh="http://schemas.microsoft.com/office/word/2020/wordml/sdtdatahash" xmlns:w16sdtfl="http://schemas.microsoft.com/office/word/2024/wordml/sdtformatlock" xmlns:w16se="http://schemas.microsoft.com/office/word/2015/wordml/symex" xmlns:wpg="http://schemas.microsoft.com/office/word/2010/wordprocessingGroup" xmlns:wpi="http://schemas.microsoft.com/office/word/2010/wordprocessingInk" xmlns:wne="http://schemas.microsoft.com/office/word/2006/wordml" xmlns:wps="http://schemas.microsoft.com/office/word/2010/wordprocessingShape" mc:Ignorable="w14 w15 w16se w16cid w16 w16cex w16sdtdh w16sdtfl w16du wp14">
-  <w:p>
-    <w:pPr>
-      <w:pStyle w:val="Header"/>
-    </w:pPr>
   </w:p>
 </w:hdr>
 </file>

</xml_diff>